<commit_message>
Restore CSPG4 Letter Figure 1 and clarify initial comparator selection
</commit_message>
<xml_diff>
--- a/research/release-candidates/preprint-short-formats-20260924/author-review/CSPG4-letter.docx
+++ b/research/release-candidates/preprint-short-formats-20260924/author-review/CSPG4-letter.docx
@@ -39,7 +39,7 @@
         <w:rPr>
           <w:b w:val="0"/>
         </w:rPr>
-        <w:t>Extraskeletal myxoid chondrosarcoma (EMC) is a rare soft-tissue sarcoma characteristically associated with NR4A3 rearrangements.[1] Chondroitin sulfate proteoglycan 4 (CSPG4) is a cell-surface protein with heterogeneous expression across sarcoma types.[2] CSPG4 stood out in an exploratory assessment of 11 manually curated candidate therapeutic targets in EMC. Higher RNA expression than in three investigator-selected comparators—myxoid liposarcoma, low-grade fibromyxoid sarcoma (LGFMS) and synovial sarcoma—motivated examination of its position within a broader sarcoma reference.</w:t>
+        <w:t>Extraskeletal myxoid chondrosarcoma (EMC) is a rare soft-tissue sarcoma characteristically associated with NR4A3 rearrangements.[1] Chondroitin sulfate proteoglycan 4 (CSPG4) is a cell-surface protein with heterogeneous expression across sarcoma types.[2] CSPG4 stood out in an exploratory assessment of 11 manually curated candidate therapeutic targets in EMC. For the initial reanalysis, myxoid liposarcoma, low-grade fibromyxoid sarcoma (LGFMS) and synovial sarcoma were chosen as morphologically and diagnostically relevant comparisons with EMC. Higher CSPG4 RNA expression in EMC than in these groups motivated examination of its position within a broader sarcoma reference.</w:t>
       </w:r>
     </w:p>
     <w:p>
@@ -79,7 +79,7 @@
         <w:rPr>
           <w:b w:val="0"/>
         </w:rPr>
-        <w:t>EMC had the highest observed median within the primary comparison, although distributions overlapped. GIST (n=14) and DFSP (n=10) had slightly higher medians, 59.24 and 59.10 TPM, in the broader comparison. Some benign categories also showed high expression. In the historical GSE24369 array collection,[4] all six EMC biopsies exceeded the 17 LGFMS biopsies in CSPG4 signal (A=1.000); the corresponding RNA-sequencing comparison involved nine EMC and 13 LGFMS specimens (A=0.966). Each assay retained its own measurement scale. Additional public collections expanded histologic context but supplied no additional explicitly labeled EMC comparison.</w:t>
+        <w:t>EMC had the highest observed median within the primary comparison, although distributions overlapped (Figure 1). GIST (n=14) and DFSP (n=10) had slightly higher medians, 59.24 and 59.10 TPM, in the broader comparison. Some benign categories also showed high expression. In the historical GSE24369 array collection,[4] all six EMC biopsies exceeded the 17 LGFMS biopsies in CSPG4 signal (A=1.000); the corresponding RNA-sequencing comparison involved nine EMC and 13 LGFMS specimens (A=0.966). Each assay retained its own measurement scale. Additional public collections expanded histologic context but supplied no additional explicitly labeled EMC comparison.</w:t>
       </w:r>
     </w:p>
     <w:p>
@@ -288,10 +288,85 @@
         <w:t>[5] Leuci V, Donini C, Grignani G, Rotolo R, Mesiano G, Fiorino E, et al. CSPG4-Specific CAR.CIK Lymphocytes as a Novel Therapy for the Treatment of Multiple Soft-Tissue Sarcoma Histotypes. Clin Cancer Res. 2020;26:6321–34. https://doi.org/10.1158/1078-0432.CCR-20-0357.</w:t>
       </w:r>
     </w:p>
+    <w:p>
+      <w:pPr>
+        <w:sectPr>
+          <w:footerReference w:type="default" r:id="rId9"/>
+          <w:pgSz w:w="12240" w:h="15840"/>
+          <w:pgMar w:top="1080" w:right="1224" w:bottom="1080" w:left="1224" w:header="720" w:footer="720" w:gutter="0"/>
+          <w:cols w:space="720"/>
+          <w:docGrid w:linePitch="360"/>
+        </w:sectPr>
+      </w:pPr>
+    </w:p>
+    <w:p>
+      <w:pPr>
+        <w:spacing w:after="120" w:line="240" w:lineRule="auto"/>
+        <w:jc w:val="center"/>
+      </w:pPr>
+      <w:r>
+        <w:drawing>
+          <wp:inline xmlns:a="http://schemas.openxmlformats.org/drawingml/2006/main" xmlns:pic="http://schemas.openxmlformats.org/drawingml/2006/picture">
+            <wp:extent cx="8686800" cy="5754294"/>
+            <wp:docPr id="1" name="Picture 1"/>
+            <wp:cNvGraphicFramePr>
+              <a:graphicFrameLocks noChangeAspect="1"/>
+            </wp:cNvGraphicFramePr>
+            <a:graphic>
+              <a:graphicData uri="http://schemas.openxmlformats.org/drawingml/2006/picture">
+                <pic:pic>
+                  <pic:nvPicPr>
+                    <pic:cNvPr id="0" name="image.png"/>
+                    <pic:cNvPicPr/>
+                  </pic:nvPicPr>
+                  <pic:blipFill>
+                    <a:blip r:embed="rId10"/>
+                    <a:stretch>
+                      <a:fillRect/>
+                    </a:stretch>
+                  </pic:blipFill>
+                  <pic:spPr>
+                    <a:xfrm>
+                      <a:off x="0" y="0"/>
+                      <a:ext cx="8686800" cy="5754294"/>
+                    </a:xfrm>
+                    <a:prstGeom prst="rect"/>
+                  </pic:spPr>
+                </pic:pic>
+              </a:graphicData>
+            </a:graphic>
+          </wp:inline>
+        </w:drawing>
+      </w:r>
+    </w:p>
+    <w:p>
+      <w:pPr>
+        <w:spacing w:line="250" w:lineRule="auto"/>
+      </w:pPr>
+      <w:r>
+        <w:rPr>
+          <w:b w:val="0"/>
+          <w:sz w:val="18"/>
+        </w:rPr>
+      </w:r>
+      <w:r>
+        <w:rPr>
+          <w:b/>
+          <w:sz w:val="18"/>
+        </w:rPr>
+        <w:t>Figure 1. CSPG4 RNA across sarcoma and related tumor categories.</w:t>
+      </w:r>
+      <w:r>
+        <w:rPr>
+          <w:b w:val="0"/>
+          <w:sz w:val="18"/>
+        </w:rPr>
+        <w:t xml:space="preserve"> The 498 specimens span 38 source diagnosis labels: nine EMC, 393 primary-reference specimens and 96 additional specimens marked by asterisks. Asterisks identify categories classified as Intermediate in the source; all other non-EMC rows form the Malignant-category reference. The broader reference includes both sets. Dots show specimens, horizontal segments interquartile ranges and vertical marks medians. The axis uses log2(1+TPM) spacing with TPM labels; categories are ordered by observed median. Other eligible contexts appear in Figure S1. MIFS/HFLT, myxoinflammatory fibroblastic sarcoma/hemosiderotic fibrolipomatous tumor; NOS, not otherwise specified.</w:t>
+      </w:r>
+    </w:p>
     <w:sectPr>
-      <w:footerReference w:type="default" r:id="rId9"/>
-      <w:pgSz w:w="12240" w:h="15840"/>
-      <w:pgMar w:top="1080" w:right="1224" w:bottom="1080" w:left="1224" w:header="720" w:footer="720" w:gutter="0"/>
+      <w:pgSz w:w="15840" w:h="12240" w:orient="landscape"/>
+      <w:pgMar w:top="648" w:right="936" w:bottom="648" w:left="936" w:header="720" w:footer="720" w:gutter="0"/>
       <w:cols w:space="720"/>
       <w:docGrid w:linePitch="360"/>
     </w:sectPr>

</xml_diff>